<commit_message>
Edited Piece 3 till end (need to figure out starting instrument for zhudi)
</commit_message>
<xml_diff>
--- a/Front Matter/Front Matter_v6a.docx
+++ b/Front Matter/Front Matter_v6a.docx
@@ -1839,6 +1839,15 @@
       </w:pPr>
       <w:r>
         <w:rPr>
+          <w:rFonts w:ascii="Noto Serif SC" w:eastAsia="Noto Serif SC" w:hAnsi="Noto Serif SC" w:cs="Noto Serif"/>
+          <w:sz w:val="24"/>
+          <w:szCs w:val="24"/>
+          <w:lang w:val="en-GB"/>
+        </w:rPr>
+        <w:t xml:space="preserve">2 </w:t>
+      </w:r>
+      <w:r>
+        <w:rPr>
           <w:rFonts w:ascii="Noto Serif SC" w:eastAsia="Noto Serif SC" w:hAnsi="Noto Serif SC" w:cs="Noto Serif" w:hint="eastAsia"/>
           <w:sz w:val="24"/>
           <w:szCs w:val="24"/>
@@ -1853,16 +1862,25 @@
           <w:szCs w:val="24"/>
           <w:lang w:val="en-GB"/>
         </w:rPr>
-        <w:t xml:space="preserve"> I, II </w:t>
-      </w:r>
-      <w:r>
-        <w:rPr>
-          <w:rFonts w:ascii="Noto Serif SC" w:eastAsia="Noto Serif SC" w:hAnsi="Noto Serif SC" w:cs="Noto Serif"/>
-          <w:sz w:val="24"/>
-          <w:szCs w:val="24"/>
-          <w:lang w:val="en-GB"/>
-        </w:rPr>
-        <w:t xml:space="preserve">| </w:t>
+        <w:t xml:space="preserve"> </w:t>
+      </w:r>
+      <w:r>
+        <w:rPr>
+          <w:rFonts w:ascii="Noto Serif SC" w:eastAsia="Noto Serif SC" w:hAnsi="Noto Serif SC" w:cs="Noto Serif"/>
+          <w:sz w:val="24"/>
+          <w:szCs w:val="24"/>
+          <w:lang w:val="en-GB"/>
+        </w:rPr>
+        <w:t>2</w:t>
+      </w:r>
+      <w:r>
+        <w:rPr>
+          <w:rFonts w:ascii="Noto Serif SC" w:eastAsia="Noto Serif SC" w:hAnsi="Noto Serif SC" w:cs="Noto Serif"/>
+          <w:sz w:val="24"/>
+          <w:szCs w:val="24"/>
+          <w:lang w:val="en-GB"/>
+        </w:rPr>
+        <w:t xml:space="preserve"> </w:t>
       </w:r>
       <w:proofErr w:type="spellStart"/>
       <w:r>
@@ -1875,25 +1893,25 @@
         <w:t>Bangdi</w:t>
       </w:r>
       <w:proofErr w:type="spellEnd"/>
-      <w:r>
-        <w:rPr>
-          <w:rFonts w:ascii="Noto Serif SC" w:eastAsia="Noto Serif SC" w:hAnsi="Noto Serif SC" w:cs="Noto Serif"/>
-          <w:sz w:val="24"/>
-          <w:szCs w:val="24"/>
-          <w:lang w:val="en-GB"/>
-        </w:rPr>
-        <w:t xml:space="preserve"> I, II</w:t>
-      </w:r>
-    </w:p>
-    <w:p>
-      <w:pPr>
-        <w:rPr>
-          <w:rFonts w:ascii="Noto Serif SC" w:eastAsia="Noto Serif SC" w:hAnsi="Noto Serif SC" w:cs="Noto Serif"/>
-          <w:sz w:val="24"/>
-          <w:szCs w:val="24"/>
-          <w:lang w:val="en-US"/>
-        </w:rPr>
-      </w:pPr>
+    </w:p>
+    <w:p>
+      <w:pPr>
+        <w:rPr>
+          <w:rFonts w:ascii="Noto Serif SC" w:eastAsia="Noto Serif SC" w:hAnsi="Noto Serif SC" w:cs="Noto Serif"/>
+          <w:sz w:val="24"/>
+          <w:szCs w:val="24"/>
+          <w:lang w:val="en-US"/>
+        </w:rPr>
+      </w:pPr>
+      <w:r>
+        <w:rPr>
+          <w:rFonts w:ascii="Noto Serif SC" w:eastAsia="Noto Serif SC" w:hAnsi="Noto Serif SC" w:cs="Noto Serif"/>
+          <w:sz w:val="24"/>
+          <w:szCs w:val="24"/>
+          <w:lang w:val="en-US"/>
+        </w:rPr>
+        <w:t xml:space="preserve">1 </w:t>
+      </w:r>
       <w:r>
         <w:rPr>
           <w:rFonts w:ascii="Noto Serif SC" w:eastAsia="Noto Serif SC" w:hAnsi="Noto Serif SC" w:cs="Noto Serif" w:hint="eastAsia"/>
@@ -1910,7 +1928,16 @@
           <w:szCs w:val="24"/>
           <w:lang w:val="en-US"/>
         </w:rPr>
-        <w:t xml:space="preserve"> (</w:t>
+        <w:t xml:space="preserve"> </w:t>
+      </w:r>
+      <w:r>
+        <w:rPr>
+          <w:rFonts w:ascii="Noto Serif SC" w:eastAsia="Noto Serif SC" w:hAnsi="Noto Serif SC" w:cs="Noto Serif"/>
+          <w:sz w:val="24"/>
+          <w:szCs w:val="24"/>
+          <w:lang w:val="en-US"/>
+        </w:rPr>
+        <w:t xml:space="preserve">1 </w:t>
       </w:r>
       <w:proofErr w:type="spellStart"/>
       <w:r>
@@ -1923,25 +1950,25 @@
         <w:t>Qudi</w:t>
       </w:r>
       <w:proofErr w:type="spellEnd"/>
-      <w:r>
-        <w:rPr>
-          <w:rFonts w:ascii="Noto Serif SC" w:eastAsia="Noto Serif SC" w:hAnsi="Noto Serif SC" w:cs="Noto Serif"/>
-          <w:sz w:val="24"/>
-          <w:szCs w:val="24"/>
-          <w:lang w:val="en-US"/>
-        </w:rPr>
-        <w:t>)</w:t>
-      </w:r>
-    </w:p>
-    <w:p>
-      <w:pPr>
-        <w:rPr>
-          <w:rFonts w:ascii="Noto Serif SC" w:eastAsia="Noto Serif SC" w:hAnsi="Noto Serif SC" w:cs="Noto Serif"/>
-          <w:sz w:val="24"/>
-          <w:szCs w:val="24"/>
-          <w:lang w:val="en-GB"/>
-        </w:rPr>
-      </w:pPr>
+    </w:p>
+    <w:p>
+      <w:pPr>
+        <w:rPr>
+          <w:rFonts w:ascii="Noto Serif SC" w:eastAsia="Noto Serif SC" w:hAnsi="Noto Serif SC" w:cs="Noto Serif"/>
+          <w:sz w:val="24"/>
+          <w:szCs w:val="24"/>
+          <w:lang w:val="en-GB"/>
+        </w:rPr>
+      </w:pPr>
+      <w:r>
+        <w:rPr>
+          <w:rFonts w:ascii="Noto Serif SC" w:eastAsia="Noto Serif SC" w:hAnsi="Noto Serif SC" w:cs="Noto Serif"/>
+          <w:sz w:val="24"/>
+          <w:szCs w:val="24"/>
+          <w:lang w:val="en-GB"/>
+        </w:rPr>
+        <w:t xml:space="preserve">2 </w:t>
+      </w:r>
       <w:r>
         <w:rPr>
           <w:rFonts w:ascii="Noto Serif SC" w:eastAsia="Noto Serif SC" w:hAnsi="Noto Serif SC" w:cs="Noto Serif" w:hint="eastAsia"/>
@@ -1958,7 +1985,16 @@
           <w:szCs w:val="24"/>
           <w:lang w:val="en-GB"/>
         </w:rPr>
-        <w:t xml:space="preserve"> I, II (</w:t>
+        <w:t xml:space="preserve"> </w:t>
+      </w:r>
+      <w:r>
+        <w:rPr>
+          <w:rFonts w:ascii="Noto Serif SC" w:eastAsia="Noto Serif SC" w:hAnsi="Noto Serif SC" w:cs="Noto Serif"/>
+          <w:sz w:val="24"/>
+          <w:szCs w:val="24"/>
+          <w:lang w:val="en-GB"/>
+        </w:rPr>
+        <w:t xml:space="preserve">2 </w:t>
       </w:r>
       <w:proofErr w:type="spellStart"/>
       <w:r>
@@ -1971,35 +2007,35 @@
         <w:t>Xindi</w:t>
       </w:r>
       <w:proofErr w:type="spellEnd"/>
-      <w:r>
-        <w:rPr>
-          <w:rFonts w:ascii="Noto Serif SC" w:eastAsia="Noto Serif SC" w:hAnsi="Noto Serif SC" w:cs="Noto Serif"/>
-          <w:sz w:val="24"/>
-          <w:szCs w:val="24"/>
-          <w:lang w:val="en-GB"/>
-        </w:rPr>
-        <w:t xml:space="preserve"> I, II)</w:t>
-      </w:r>
-    </w:p>
-    <w:p>
-      <w:pPr>
-        <w:rPr>
-          <w:rFonts w:ascii="Noto Serif SC" w:eastAsia="Noto Serif SC" w:hAnsi="Noto Serif SC" w:cs="Noto Serif"/>
-          <w:sz w:val="24"/>
-          <w:szCs w:val="24"/>
-          <w:lang w:val="en-GB"/>
-        </w:rPr>
-      </w:pPr>
-    </w:p>
-    <w:p>
-      <w:pPr>
-        <w:rPr>
-          <w:rFonts w:ascii="Noto Serif SC" w:eastAsia="Noto Serif SC" w:hAnsi="Noto Serif SC" w:cs="Noto Serif"/>
-          <w:sz w:val="24"/>
-          <w:szCs w:val="24"/>
-          <w:lang w:val="en-GB"/>
-        </w:rPr>
-      </w:pPr>
+    </w:p>
+    <w:p>
+      <w:pPr>
+        <w:rPr>
+          <w:rFonts w:ascii="Noto Serif SC" w:eastAsia="Noto Serif SC" w:hAnsi="Noto Serif SC" w:cs="Noto Serif"/>
+          <w:sz w:val="24"/>
+          <w:szCs w:val="24"/>
+          <w:lang w:val="en-GB"/>
+        </w:rPr>
+      </w:pPr>
+    </w:p>
+    <w:p>
+      <w:pPr>
+        <w:rPr>
+          <w:rFonts w:ascii="Noto Serif SC" w:eastAsia="Noto Serif SC" w:hAnsi="Noto Serif SC" w:cs="Noto Serif"/>
+          <w:sz w:val="24"/>
+          <w:szCs w:val="24"/>
+          <w:lang w:val="en-GB"/>
+        </w:rPr>
+      </w:pPr>
+      <w:r>
+        <w:rPr>
+          <w:rFonts w:ascii="Noto Serif SC" w:eastAsia="Noto Serif SC" w:hAnsi="Noto Serif SC" w:cs="Noto Serif"/>
+          <w:sz w:val="24"/>
+          <w:szCs w:val="24"/>
+          <w:lang w:val="en-GB"/>
+        </w:rPr>
+        <w:t xml:space="preserve">2 </w:t>
+      </w:r>
       <w:r>
         <w:rPr>
           <w:rFonts w:ascii="Noto Serif SC" w:eastAsia="Noto Serif SC" w:hAnsi="Noto Serif SC" w:cs="Noto Serif" w:hint="eastAsia"/>
@@ -2016,7 +2052,16 @@
           <w:szCs w:val="24"/>
           <w:lang w:val="en-GB"/>
         </w:rPr>
-        <w:t xml:space="preserve"> I, II (</w:t>
+        <w:t xml:space="preserve"> </w:t>
+      </w:r>
+      <w:r>
+        <w:rPr>
+          <w:rFonts w:ascii="Noto Serif SC" w:eastAsia="Noto Serif SC" w:hAnsi="Noto Serif SC" w:cs="Noto Serif"/>
+          <w:sz w:val="24"/>
+          <w:szCs w:val="24"/>
+          <w:lang w:val="en-GB"/>
+        </w:rPr>
+        <w:t xml:space="preserve">2 </w:t>
       </w:r>
       <w:proofErr w:type="spellStart"/>
       <w:r>
@@ -2036,18 +2081,36 @@
           <w:szCs w:val="24"/>
           <w:lang w:val="en-GB"/>
         </w:rPr>
-        <w:t xml:space="preserve"> Sheng I, II)</w:t>
-      </w:r>
-    </w:p>
-    <w:p>
-      <w:pPr>
-        <w:rPr>
-          <w:rFonts w:ascii="Noto Serif SC" w:eastAsia="Noto Serif SC" w:hAnsi="Noto Serif SC" w:cs="Noto Serif"/>
-          <w:sz w:val="24"/>
-          <w:szCs w:val="24"/>
-          <w:lang w:val="en-GB"/>
-        </w:rPr>
-      </w:pPr>
+        <w:t xml:space="preserve"> </w:t>
+      </w:r>
+      <w:r>
+        <w:rPr>
+          <w:rFonts w:ascii="Noto Serif SC" w:eastAsia="Noto Serif SC" w:hAnsi="Noto Serif SC" w:cs="Noto Serif"/>
+          <w:sz w:val="24"/>
+          <w:szCs w:val="24"/>
+          <w:lang w:val="en-GB"/>
+        </w:rPr>
+        <w:t>Sheng</w:t>
+      </w:r>
+    </w:p>
+    <w:p>
+      <w:pPr>
+        <w:rPr>
+          <w:rFonts w:ascii="Noto Serif SC" w:eastAsia="Noto Serif SC" w:hAnsi="Noto Serif SC" w:cs="Noto Serif"/>
+          <w:sz w:val="24"/>
+          <w:szCs w:val="24"/>
+          <w:lang w:val="en-GB"/>
+        </w:rPr>
+      </w:pPr>
+      <w:r>
+        <w:rPr>
+          <w:rFonts w:ascii="Noto Serif SC" w:eastAsia="Noto Serif SC" w:hAnsi="Noto Serif SC" w:cs="Noto Serif"/>
+          <w:sz w:val="24"/>
+          <w:szCs w:val="24"/>
+          <w:lang w:val="en-GB"/>
+        </w:rPr>
+        <w:t>1</w:t>
+      </w:r>
       <w:r>
         <w:rPr>
           <w:rFonts w:ascii="Noto Serif SC" w:eastAsia="Noto Serif SC" w:hAnsi="Noto Serif SC" w:cs="Noto Serif" w:hint="eastAsia"/>
@@ -2064,7 +2127,16 @@
           <w:szCs w:val="24"/>
           <w:lang w:val="en-GB"/>
         </w:rPr>
-        <w:t xml:space="preserve"> (</w:t>
+        <w:t xml:space="preserve"> </w:t>
+      </w:r>
+      <w:r>
+        <w:rPr>
+          <w:rFonts w:ascii="Noto Serif SC" w:eastAsia="Noto Serif SC" w:hAnsi="Noto Serif SC" w:cs="Noto Serif"/>
+          <w:sz w:val="24"/>
+          <w:szCs w:val="24"/>
+          <w:lang w:val="en-GB"/>
+        </w:rPr>
+        <w:t xml:space="preserve">1 </w:t>
       </w:r>
       <w:proofErr w:type="spellStart"/>
       <w:r>
@@ -2084,18 +2156,27 @@
           <w:szCs w:val="24"/>
           <w:lang w:val="en-GB"/>
         </w:rPr>
-        <w:t xml:space="preserve"> Sheng)</w:t>
-      </w:r>
-    </w:p>
-    <w:p>
-      <w:pPr>
-        <w:rPr>
-          <w:rFonts w:ascii="Noto Serif SC" w:eastAsia="Noto Serif SC" w:hAnsi="Noto Serif SC" w:cs="Noto Serif"/>
-          <w:sz w:val="24"/>
-          <w:szCs w:val="24"/>
-          <w:lang w:val="en-GB"/>
-        </w:rPr>
-      </w:pPr>
+        <w:t xml:space="preserve"> Sheng</w:t>
+      </w:r>
+    </w:p>
+    <w:p>
+      <w:pPr>
+        <w:rPr>
+          <w:rFonts w:ascii="Noto Serif SC" w:eastAsia="Noto Serif SC" w:hAnsi="Noto Serif SC" w:cs="Noto Serif"/>
+          <w:sz w:val="24"/>
+          <w:szCs w:val="24"/>
+          <w:lang w:val="en-GB"/>
+        </w:rPr>
+      </w:pPr>
+      <w:r>
+        <w:rPr>
+          <w:rFonts w:ascii="Noto Serif SC" w:eastAsia="Noto Serif SC" w:hAnsi="Noto Serif SC" w:cs="Noto Serif"/>
+          <w:sz w:val="24"/>
+          <w:szCs w:val="24"/>
+          <w:lang w:val="en-GB"/>
+        </w:rPr>
+        <w:t>1</w:t>
+      </w:r>
       <w:r>
         <w:rPr>
           <w:rFonts w:ascii="Noto Serif SC" w:eastAsia="Noto Serif SC" w:hAnsi="Noto Serif SC" w:cs="Noto Serif" w:hint="eastAsia"/>
@@ -2112,28 +2193,66 @@
           <w:szCs w:val="24"/>
           <w:lang w:val="en-GB"/>
         </w:rPr>
-        <w:t xml:space="preserve"> (Diyin Sheng)</w:t>
-      </w:r>
-    </w:p>
-    <w:p>
-      <w:pPr>
-        <w:rPr>
-          <w:rFonts w:ascii="Noto Serif SC" w:eastAsia="Noto Serif SC" w:hAnsi="Noto Serif SC" w:cs="Noto Serif"/>
-          <w:sz w:val="24"/>
-          <w:szCs w:val="24"/>
-          <w:lang w:val="en-US"/>
-        </w:rPr>
-      </w:pPr>
-    </w:p>
-    <w:p>
-      <w:pPr>
-        <w:rPr>
-          <w:rFonts w:ascii="Noto Serif SC" w:eastAsia="Noto Serif SC" w:hAnsi="Noto Serif SC" w:cs="Noto Serif"/>
-          <w:sz w:val="24"/>
-          <w:szCs w:val="24"/>
-          <w:lang w:val="en-GB"/>
-        </w:rPr>
-      </w:pPr>
+        <w:t xml:space="preserve"> </w:t>
+      </w:r>
+      <w:r>
+        <w:rPr>
+          <w:rFonts w:ascii="Noto Serif SC" w:eastAsia="Noto Serif SC" w:hAnsi="Noto Serif SC" w:cs="Noto Serif"/>
+          <w:sz w:val="24"/>
+          <w:szCs w:val="24"/>
+          <w:lang w:val="en-GB"/>
+        </w:rPr>
+        <w:t xml:space="preserve">1 </w:t>
+      </w:r>
+      <w:proofErr w:type="spellStart"/>
+      <w:r>
+        <w:rPr>
+          <w:rFonts w:ascii="Noto Serif SC" w:eastAsia="Noto Serif SC" w:hAnsi="Noto Serif SC" w:cs="Noto Serif"/>
+          <w:sz w:val="24"/>
+          <w:szCs w:val="24"/>
+          <w:lang w:val="en-GB"/>
+        </w:rPr>
+        <w:t>Diyin</w:t>
+      </w:r>
+      <w:proofErr w:type="spellEnd"/>
+      <w:r>
+        <w:rPr>
+          <w:rFonts w:ascii="Noto Serif SC" w:eastAsia="Noto Serif SC" w:hAnsi="Noto Serif SC" w:cs="Noto Serif"/>
+          <w:sz w:val="24"/>
+          <w:szCs w:val="24"/>
+          <w:lang w:val="en-GB"/>
+        </w:rPr>
+        <w:t xml:space="preserve"> Sheng</w:t>
+      </w:r>
+    </w:p>
+    <w:p>
+      <w:pPr>
+        <w:rPr>
+          <w:rFonts w:ascii="Noto Serif SC" w:eastAsia="Noto Serif SC" w:hAnsi="Noto Serif SC" w:cs="Noto Serif"/>
+          <w:sz w:val="24"/>
+          <w:szCs w:val="24"/>
+          <w:lang w:val="en-US"/>
+        </w:rPr>
+      </w:pPr>
+    </w:p>
+    <w:p>
+      <w:pPr>
+        <w:rPr>
+          <w:rFonts w:ascii="Noto Serif SC" w:eastAsia="Noto Serif SC" w:hAnsi="Noto Serif SC" w:cs="Noto Serif"/>
+          <w:sz w:val="24"/>
+          <w:szCs w:val="24"/>
+          <w:lang w:val="en-GB"/>
+        </w:rPr>
+      </w:pPr>
+      <w:r>
+        <w:rPr>
+          <w:rFonts w:ascii="Noto Serif SC" w:eastAsia="Noto Serif SC" w:hAnsi="Noto Serif SC" w:cs="Noto Serif"/>
+          <w:sz w:val="24"/>
+          <w:szCs w:val="24"/>
+          <w:lang w:val="en-GB"/>
+        </w:rPr>
+        <w:t xml:space="preserve">2 </w:t>
+      </w:r>
       <w:r>
         <w:rPr>
           <w:rFonts w:ascii="Noto Serif SC" w:eastAsia="Noto Serif SC" w:hAnsi="Noto Serif SC" w:cs="Noto Serif" w:hint="eastAsia"/>
@@ -2157,18 +2276,9 @@
           <w:rFonts w:ascii="Noto Serif SC" w:eastAsia="Noto Serif SC" w:hAnsi="Noto Serif SC" w:cs="Noto Serif"/>
           <w:sz w:val="24"/>
           <w:szCs w:val="24"/>
-          <w:lang w:val="en-US"/>
-        </w:rPr>
-        <w:t xml:space="preserve"> I, II</w:t>
-      </w:r>
-      <w:r>
-        <w:rPr>
-          <w:rFonts w:ascii="Noto Serif SC" w:eastAsia="Noto Serif SC" w:hAnsi="Noto Serif SC" w:cs="Noto Serif"/>
-          <w:sz w:val="24"/>
-          <w:szCs w:val="24"/>
-          <w:lang w:val="en-GB"/>
-        </w:rPr>
-        <w:t xml:space="preserve"> (</w:t>
+          <w:lang w:val="en-GB"/>
+        </w:rPr>
+        <w:t xml:space="preserve">2 </w:t>
       </w:r>
       <w:proofErr w:type="spellStart"/>
       <w:r>
@@ -2201,25 +2311,25 @@
         <w:t>Suona</w:t>
       </w:r>
       <w:proofErr w:type="spellEnd"/>
-      <w:r>
-        <w:rPr>
-          <w:rFonts w:ascii="Noto Serif SC" w:eastAsia="Noto Serif SC" w:hAnsi="Noto Serif SC" w:cs="Noto Serif"/>
-          <w:sz w:val="24"/>
-          <w:szCs w:val="24"/>
-          <w:lang w:val="en-GB"/>
-        </w:rPr>
-        <w:t xml:space="preserve"> I, II)</w:t>
-      </w:r>
-    </w:p>
-    <w:p>
-      <w:pPr>
-        <w:rPr>
-          <w:rFonts w:ascii="Noto Serif SC" w:eastAsia="Noto Serif SC" w:hAnsi="Noto Serif SC" w:cs="Noto Serif"/>
-          <w:sz w:val="24"/>
-          <w:szCs w:val="24"/>
-          <w:lang w:val="en-US"/>
-        </w:rPr>
-      </w:pPr>
+    </w:p>
+    <w:p>
+      <w:pPr>
+        <w:rPr>
+          <w:rFonts w:ascii="Noto Serif SC" w:eastAsia="Noto Serif SC" w:hAnsi="Noto Serif SC" w:cs="Noto Serif"/>
+          <w:sz w:val="24"/>
+          <w:szCs w:val="24"/>
+          <w:lang w:val="en-US"/>
+        </w:rPr>
+      </w:pPr>
+      <w:r>
+        <w:rPr>
+          <w:rFonts w:ascii="Noto Serif SC" w:eastAsia="Noto Serif SC" w:hAnsi="Noto Serif SC" w:cs="Noto Serif"/>
+          <w:sz w:val="24"/>
+          <w:szCs w:val="24"/>
+          <w:lang w:val="en-US"/>
+        </w:rPr>
+        <w:t>1</w:t>
+      </w:r>
       <w:r>
         <w:rPr>
           <w:rFonts w:ascii="Noto Serif SC" w:eastAsia="Noto Serif SC" w:hAnsi="Noto Serif SC" w:cs="Noto Serif" w:hint="eastAsia"/>
@@ -2236,7 +2346,7 @@
           <w:szCs w:val="24"/>
           <w:lang w:val="en-US"/>
         </w:rPr>
-        <w:t xml:space="preserve"> (</w:t>
+        <w:t xml:space="preserve"> </w:t>
       </w:r>
       <w:proofErr w:type="spellStart"/>
       <w:r>
@@ -2269,25 +2379,25 @@
         <w:t>Suona</w:t>
       </w:r>
       <w:proofErr w:type="spellEnd"/>
-      <w:r>
-        <w:rPr>
-          <w:rFonts w:ascii="Noto Serif SC" w:eastAsia="Noto Serif SC" w:hAnsi="Noto Serif SC" w:cs="Noto Serif"/>
-          <w:sz w:val="24"/>
-          <w:szCs w:val="24"/>
-          <w:lang w:val="en-US"/>
-        </w:rPr>
-        <w:t>)</w:t>
-      </w:r>
-    </w:p>
-    <w:p>
-      <w:pPr>
-        <w:rPr>
-          <w:rFonts w:ascii="Noto Serif SC" w:eastAsia="Noto Serif SC" w:hAnsi="Noto Serif SC" w:cs="Noto Serif"/>
-          <w:sz w:val="24"/>
-          <w:szCs w:val="24"/>
-          <w:lang w:val="en-US"/>
-        </w:rPr>
-      </w:pPr>
+    </w:p>
+    <w:p>
+      <w:pPr>
+        <w:rPr>
+          <w:rFonts w:ascii="Noto Serif SC" w:eastAsia="Noto Serif SC" w:hAnsi="Noto Serif SC" w:cs="Noto Serif"/>
+          <w:sz w:val="24"/>
+          <w:szCs w:val="24"/>
+          <w:lang w:val="en-US"/>
+        </w:rPr>
+      </w:pPr>
+      <w:r>
+        <w:rPr>
+          <w:rFonts w:ascii="Noto Serif SC" w:eastAsia="Noto Serif SC" w:hAnsi="Noto Serif SC" w:cs="Noto Serif"/>
+          <w:sz w:val="24"/>
+          <w:szCs w:val="24"/>
+          <w:lang w:val="en-US"/>
+        </w:rPr>
+        <w:t>1</w:t>
+      </w:r>
       <w:r>
         <w:rPr>
           <w:rFonts w:ascii="Noto Serif SC" w:eastAsia="Noto Serif SC" w:hAnsi="Noto Serif SC" w:cs="Noto Serif" w:hint="eastAsia"/>
@@ -2304,7 +2414,16 @@
           <w:szCs w:val="24"/>
           <w:lang w:val="en-US"/>
         </w:rPr>
-        <w:t xml:space="preserve"> (</w:t>
+        <w:t xml:space="preserve"> </w:t>
+      </w:r>
+      <w:r>
+        <w:rPr>
+          <w:rFonts w:ascii="Noto Serif SC" w:eastAsia="Noto Serif SC" w:hAnsi="Noto Serif SC" w:cs="Noto Serif"/>
+          <w:sz w:val="24"/>
+          <w:szCs w:val="24"/>
+          <w:lang w:val="en-US"/>
+        </w:rPr>
+        <w:t xml:space="preserve">1 </w:t>
       </w:r>
       <w:proofErr w:type="spellStart"/>
       <w:r>
@@ -2335,25 +2454,25 @@
         <w:t>Suona</w:t>
       </w:r>
       <w:proofErr w:type="spellEnd"/>
-      <w:r>
-        <w:rPr>
-          <w:rFonts w:ascii="Noto Serif SC" w:eastAsia="Noto Serif SC" w:hAnsi="Noto Serif SC" w:cs="Noto Serif"/>
-          <w:sz w:val="24"/>
-          <w:szCs w:val="24"/>
-          <w:lang w:val="en-US"/>
-        </w:rPr>
-        <w:t>)</w:t>
-      </w:r>
-    </w:p>
-    <w:p>
-      <w:pPr>
-        <w:rPr>
-          <w:rFonts w:ascii="Noto Serif SC" w:eastAsia="Noto Serif SC" w:hAnsi="Noto Serif SC" w:cs="Noto Serif"/>
-          <w:sz w:val="24"/>
-          <w:szCs w:val="24"/>
-          <w:lang w:val="en-US"/>
-        </w:rPr>
-      </w:pPr>
+    </w:p>
+    <w:p>
+      <w:pPr>
+        <w:rPr>
+          <w:rFonts w:ascii="Noto Serif SC" w:eastAsia="Noto Serif SC" w:hAnsi="Noto Serif SC" w:cs="Noto Serif"/>
+          <w:sz w:val="24"/>
+          <w:szCs w:val="24"/>
+          <w:lang w:val="en-US"/>
+        </w:rPr>
+      </w:pPr>
+      <w:r>
+        <w:rPr>
+          <w:rFonts w:ascii="Noto Serif SC" w:eastAsia="Noto Serif SC" w:hAnsi="Noto Serif SC" w:cs="Noto Serif"/>
+          <w:sz w:val="24"/>
+          <w:szCs w:val="24"/>
+          <w:lang w:val="en-US"/>
+        </w:rPr>
+        <w:t>1</w:t>
+      </w:r>
       <w:r>
         <w:rPr>
           <w:rFonts w:ascii="Noto Serif SC" w:eastAsia="Noto Serif SC" w:hAnsi="Noto Serif SC" w:cs="Noto Serif" w:hint="eastAsia"/>
@@ -2377,7 +2496,7 @@
           <w:szCs w:val="24"/>
           <w:lang w:val="en-US"/>
         </w:rPr>
-        <w:t>(</w:t>
+        <w:t xml:space="preserve">1 </w:t>
       </w:r>
       <w:proofErr w:type="spellStart"/>
       <w:r>
@@ -2407,35 +2526,35 @@
         <w:t>Suona</w:t>
       </w:r>
       <w:proofErr w:type="spellEnd"/>
-      <w:r>
-        <w:rPr>
-          <w:rFonts w:ascii="Noto Serif SC" w:eastAsia="Noto Serif SC" w:hAnsi="Noto Serif SC" w:cs="Noto Serif"/>
-          <w:sz w:val="24"/>
-          <w:szCs w:val="24"/>
-          <w:lang w:val="en-US"/>
-        </w:rPr>
-        <w:t>)</w:t>
-      </w:r>
-    </w:p>
-    <w:p>
-      <w:pPr>
-        <w:rPr>
-          <w:rFonts w:ascii="Noto Serif SC" w:eastAsia="Noto Serif SC" w:hAnsi="Noto Serif SC" w:cs="Noto Serif"/>
-          <w:sz w:val="24"/>
-          <w:szCs w:val="24"/>
-          <w:lang w:val="en-US"/>
-        </w:rPr>
-      </w:pPr>
-    </w:p>
-    <w:p>
-      <w:pPr>
-        <w:rPr>
-          <w:rFonts w:ascii="Noto Serif SC" w:eastAsia="Noto Serif SC" w:hAnsi="Noto Serif SC" w:cs="Noto Serif"/>
-          <w:sz w:val="24"/>
-          <w:szCs w:val="24"/>
-          <w:lang w:val="en-US"/>
-        </w:rPr>
-      </w:pPr>
+    </w:p>
+    <w:p>
+      <w:pPr>
+        <w:rPr>
+          <w:rFonts w:ascii="Noto Serif SC" w:eastAsia="Noto Serif SC" w:hAnsi="Noto Serif SC" w:cs="Noto Serif"/>
+          <w:sz w:val="24"/>
+          <w:szCs w:val="24"/>
+          <w:lang w:val="en-US"/>
+        </w:rPr>
+      </w:pPr>
+    </w:p>
+    <w:p>
+      <w:pPr>
+        <w:rPr>
+          <w:rFonts w:ascii="Noto Serif SC" w:eastAsia="Noto Serif SC" w:hAnsi="Noto Serif SC" w:cs="Noto Serif"/>
+          <w:sz w:val="24"/>
+          <w:szCs w:val="24"/>
+          <w:lang w:val="en-US"/>
+        </w:rPr>
+      </w:pPr>
+      <w:r>
+        <w:rPr>
+          <w:rFonts w:ascii="Noto Serif SC" w:eastAsia="Noto Serif SC" w:hAnsi="Noto Serif SC" w:cs="Noto Serif"/>
+          <w:sz w:val="24"/>
+          <w:szCs w:val="24"/>
+          <w:lang w:val="en-US"/>
+        </w:rPr>
+        <w:t>2</w:t>
+      </w:r>
       <w:r>
         <w:rPr>
           <w:rFonts w:ascii="Noto Serif SC" w:eastAsia="Noto Serif SC" w:hAnsi="Noto Serif SC" w:cs="Noto Serif" w:hint="eastAsia"/>
@@ -2452,18 +2571,45 @@
           <w:szCs w:val="24"/>
           <w:lang w:val="en-US"/>
         </w:rPr>
-        <w:t xml:space="preserve"> I, II (Yangqin I, II)</w:t>
-      </w:r>
-    </w:p>
-    <w:p>
-      <w:pPr>
-        <w:rPr>
-          <w:rFonts w:ascii="Noto Serif SC" w:eastAsia="Noto Serif SC" w:hAnsi="Noto Serif SC" w:cs="Noto Serif"/>
-          <w:sz w:val="24"/>
-          <w:szCs w:val="24"/>
-          <w:lang w:val="en-US"/>
-        </w:rPr>
-      </w:pPr>
+        <w:t xml:space="preserve"> </w:t>
+      </w:r>
+      <w:r>
+        <w:rPr>
+          <w:rFonts w:ascii="Noto Serif SC" w:eastAsia="Noto Serif SC" w:hAnsi="Noto Serif SC" w:cs="Noto Serif"/>
+          <w:sz w:val="24"/>
+          <w:szCs w:val="24"/>
+          <w:lang w:val="en-US"/>
+        </w:rPr>
+        <w:t xml:space="preserve">2 </w:t>
+      </w:r>
+      <w:r>
+        <w:rPr>
+          <w:rFonts w:ascii="Noto Serif SC" w:eastAsia="Noto Serif SC" w:hAnsi="Noto Serif SC" w:cs="Noto Serif"/>
+          <w:sz w:val="24"/>
+          <w:szCs w:val="24"/>
+          <w:lang w:val="en-US"/>
+        </w:rPr>
+        <w:t>Yangqin</w:t>
+      </w:r>
+    </w:p>
+    <w:p>
+      <w:pPr>
+        <w:rPr>
+          <w:rFonts w:ascii="Noto Serif SC" w:eastAsia="Noto Serif SC" w:hAnsi="Noto Serif SC" w:cs="Noto Serif"/>
+          <w:sz w:val="24"/>
+          <w:szCs w:val="24"/>
+          <w:lang w:val="en-US"/>
+        </w:rPr>
+      </w:pPr>
+      <w:r>
+        <w:rPr>
+          <w:rFonts w:ascii="Noto Serif SC" w:eastAsia="Noto Serif SC" w:hAnsi="Noto Serif SC" w:cs="Noto Serif"/>
+          <w:sz w:val="24"/>
+          <w:szCs w:val="24"/>
+          <w:lang w:val="en-US"/>
+        </w:rPr>
+        <w:t>2</w:t>
+      </w:r>
       <w:r>
         <w:rPr>
           <w:rFonts w:ascii="Noto Serif SC" w:eastAsia="Noto Serif SC" w:hAnsi="Noto Serif SC" w:cs="Noto Serif" w:hint="eastAsia"/>
@@ -2480,7 +2626,16 @@
           <w:szCs w:val="24"/>
           <w:lang w:val="en-US"/>
         </w:rPr>
-        <w:t xml:space="preserve"> I, II (</w:t>
+        <w:t xml:space="preserve"> </w:t>
+      </w:r>
+      <w:r>
+        <w:rPr>
+          <w:rFonts w:ascii="Noto Serif SC" w:eastAsia="Noto Serif SC" w:hAnsi="Noto Serif SC" w:cs="Noto Serif"/>
+          <w:sz w:val="24"/>
+          <w:szCs w:val="24"/>
+          <w:lang w:val="en-US"/>
+        </w:rPr>
+        <w:t xml:space="preserve">2 </w:t>
       </w:r>
       <w:proofErr w:type="spellStart"/>
       <w:r>
@@ -2493,25 +2648,25 @@
         <w:t>Liuqin</w:t>
       </w:r>
       <w:proofErr w:type="spellEnd"/>
-      <w:r>
-        <w:rPr>
-          <w:rFonts w:ascii="Noto Serif SC" w:eastAsia="Noto Serif SC" w:hAnsi="Noto Serif SC" w:cs="Noto Serif"/>
-          <w:sz w:val="24"/>
-          <w:szCs w:val="24"/>
-          <w:lang w:val="en-US"/>
-        </w:rPr>
-        <w:t xml:space="preserve"> I, II)</w:t>
-      </w:r>
-    </w:p>
-    <w:p>
-      <w:pPr>
-        <w:rPr>
-          <w:rFonts w:ascii="Noto Serif SC" w:eastAsia="Noto Serif SC" w:hAnsi="Noto Serif SC" w:cs="Noto Serif"/>
-          <w:sz w:val="24"/>
-          <w:szCs w:val="24"/>
-          <w:lang w:val="en-US"/>
-        </w:rPr>
-      </w:pPr>
+    </w:p>
+    <w:p>
+      <w:pPr>
+        <w:rPr>
+          <w:rFonts w:ascii="Noto Serif SC" w:eastAsia="Noto Serif SC" w:hAnsi="Noto Serif SC" w:cs="Noto Serif"/>
+          <w:sz w:val="24"/>
+          <w:szCs w:val="24"/>
+          <w:lang w:val="en-US"/>
+        </w:rPr>
+      </w:pPr>
+      <w:r>
+        <w:rPr>
+          <w:rFonts w:ascii="Noto Serif SC" w:eastAsia="Noto Serif SC" w:hAnsi="Noto Serif SC" w:cs="Noto Serif"/>
+          <w:sz w:val="24"/>
+          <w:szCs w:val="24"/>
+          <w:lang w:val="en-US"/>
+        </w:rPr>
+        <w:t xml:space="preserve">4 </w:t>
+      </w:r>
       <w:r>
         <w:rPr>
           <w:rFonts w:ascii="Noto Serif SC" w:eastAsia="Noto Serif SC" w:hAnsi="Noto Serif SC" w:cs="Noto Serif" w:hint="eastAsia"/>
@@ -2528,18 +2683,45 @@
           <w:szCs w:val="24"/>
           <w:lang w:val="en-US"/>
         </w:rPr>
-        <w:t xml:space="preserve"> I-IV (Pipa I-IV)</w:t>
-      </w:r>
-    </w:p>
-    <w:p>
-      <w:pPr>
-        <w:rPr>
-          <w:rFonts w:ascii="Noto Serif SC" w:eastAsia="Noto Serif SC" w:hAnsi="Noto Serif SC" w:cs="Noto Serif"/>
-          <w:sz w:val="24"/>
-          <w:szCs w:val="24"/>
-          <w:lang w:val="en-US"/>
-        </w:rPr>
-      </w:pPr>
+        <w:t xml:space="preserve"> </w:t>
+      </w:r>
+      <w:r>
+        <w:rPr>
+          <w:rFonts w:ascii="Noto Serif SC" w:eastAsia="Noto Serif SC" w:hAnsi="Noto Serif SC" w:cs="Noto Serif"/>
+          <w:sz w:val="24"/>
+          <w:szCs w:val="24"/>
+          <w:lang w:val="en-US"/>
+        </w:rPr>
+        <w:t xml:space="preserve">4 </w:t>
+      </w:r>
+      <w:r>
+        <w:rPr>
+          <w:rFonts w:ascii="Noto Serif SC" w:eastAsia="Noto Serif SC" w:hAnsi="Noto Serif SC" w:cs="Noto Serif"/>
+          <w:sz w:val="24"/>
+          <w:szCs w:val="24"/>
+          <w:lang w:val="en-US"/>
+        </w:rPr>
+        <w:t>Pipa</w:t>
+      </w:r>
+    </w:p>
+    <w:p>
+      <w:pPr>
+        <w:rPr>
+          <w:rFonts w:ascii="Noto Serif SC" w:eastAsia="Noto Serif SC" w:hAnsi="Noto Serif SC" w:cs="Noto Serif"/>
+          <w:sz w:val="24"/>
+          <w:szCs w:val="24"/>
+          <w:lang w:val="en-US"/>
+        </w:rPr>
+      </w:pPr>
+      <w:r>
+        <w:rPr>
+          <w:rFonts w:ascii="Noto Serif SC" w:eastAsia="Noto Serif SC" w:hAnsi="Noto Serif SC" w:cs="Noto Serif"/>
+          <w:sz w:val="24"/>
+          <w:szCs w:val="24"/>
+          <w:lang w:val="en-US"/>
+        </w:rPr>
+        <w:t>4</w:t>
+      </w:r>
       <w:r>
         <w:rPr>
           <w:rFonts w:ascii="Noto Serif SC" w:eastAsia="Noto Serif SC" w:hAnsi="Noto Serif SC" w:cs="Noto Serif" w:hint="eastAsia"/>
@@ -2556,18 +2738,45 @@
           <w:szCs w:val="24"/>
           <w:lang w:val="en-US"/>
         </w:rPr>
-        <w:t xml:space="preserve"> I-IV (Zhongruan I-IV)</w:t>
-      </w:r>
-    </w:p>
-    <w:p>
-      <w:pPr>
-        <w:rPr>
-          <w:rFonts w:ascii="Noto Serif SC" w:eastAsia="Noto Serif SC" w:hAnsi="Noto Serif SC" w:cs="Noto Serif"/>
-          <w:sz w:val="24"/>
-          <w:szCs w:val="24"/>
-          <w:lang w:val="en-US"/>
-        </w:rPr>
-      </w:pPr>
+        <w:t xml:space="preserve"> </w:t>
+      </w:r>
+      <w:r>
+        <w:rPr>
+          <w:rFonts w:ascii="Noto Serif SC" w:eastAsia="Noto Serif SC" w:hAnsi="Noto Serif SC" w:cs="Noto Serif"/>
+          <w:sz w:val="24"/>
+          <w:szCs w:val="24"/>
+          <w:lang w:val="en-US"/>
+        </w:rPr>
+        <w:t xml:space="preserve">4 </w:t>
+      </w:r>
+      <w:r>
+        <w:rPr>
+          <w:rFonts w:ascii="Noto Serif SC" w:eastAsia="Noto Serif SC" w:hAnsi="Noto Serif SC" w:cs="Noto Serif"/>
+          <w:sz w:val="24"/>
+          <w:szCs w:val="24"/>
+          <w:lang w:val="en-US"/>
+        </w:rPr>
+        <w:t>Zhongruan</w:t>
+      </w:r>
+    </w:p>
+    <w:p>
+      <w:pPr>
+        <w:rPr>
+          <w:rFonts w:ascii="Noto Serif SC" w:eastAsia="Noto Serif SC" w:hAnsi="Noto Serif SC" w:cs="Noto Serif"/>
+          <w:sz w:val="24"/>
+          <w:szCs w:val="24"/>
+          <w:lang w:val="en-US"/>
+        </w:rPr>
+      </w:pPr>
+      <w:r>
+        <w:rPr>
+          <w:rFonts w:ascii="Noto Serif SC" w:eastAsia="Noto Serif SC" w:hAnsi="Noto Serif SC" w:cs="Noto Serif"/>
+          <w:sz w:val="24"/>
+          <w:szCs w:val="24"/>
+          <w:lang w:val="en-US"/>
+        </w:rPr>
+        <w:t>2</w:t>
+      </w:r>
       <w:r>
         <w:rPr>
           <w:rFonts w:ascii="Noto Serif SC" w:eastAsia="Noto Serif SC" w:hAnsi="Noto Serif SC" w:cs="Noto Serif" w:hint="eastAsia"/>
@@ -2584,28 +2793,46 @@
           <w:szCs w:val="24"/>
           <w:lang w:val="en-US"/>
         </w:rPr>
-        <w:t xml:space="preserve"> I, II (Daruan I, II)</w:t>
-      </w:r>
-    </w:p>
-    <w:p>
-      <w:pPr>
-        <w:rPr>
-          <w:rFonts w:ascii="Noto Serif SC" w:eastAsia="Noto Serif SC" w:hAnsi="Noto Serif SC" w:cs="Noto Serif"/>
-          <w:sz w:val="24"/>
-          <w:szCs w:val="24"/>
-          <w:lang w:val="en-US"/>
-        </w:rPr>
-      </w:pPr>
-    </w:p>
-    <w:p>
-      <w:pPr>
-        <w:rPr>
-          <w:rFonts w:ascii="Noto Serif SC" w:eastAsia="Noto Serif SC" w:hAnsi="Noto Serif SC" w:cs="Noto Serif"/>
-          <w:sz w:val="24"/>
-          <w:szCs w:val="24"/>
-          <w:lang w:val="en-US"/>
-        </w:rPr>
-      </w:pPr>
+        <w:t xml:space="preserve"> </w:t>
+      </w:r>
+      <w:r>
+        <w:rPr>
+          <w:rFonts w:ascii="Noto Serif SC" w:eastAsia="Noto Serif SC" w:hAnsi="Noto Serif SC" w:cs="Noto Serif"/>
+          <w:sz w:val="24"/>
+          <w:szCs w:val="24"/>
+          <w:lang w:val="en-US"/>
+        </w:rPr>
+        <w:t>2 Daruan</w:t>
+      </w:r>
+    </w:p>
+    <w:p>
+      <w:pPr>
+        <w:rPr>
+          <w:rFonts w:ascii="Noto Serif SC" w:eastAsia="Noto Serif SC" w:hAnsi="Noto Serif SC" w:cs="Noto Serif"/>
+          <w:sz w:val="24"/>
+          <w:szCs w:val="24"/>
+          <w:lang w:val="en-US"/>
+        </w:rPr>
+      </w:pPr>
+    </w:p>
+    <w:p>
+      <w:pPr>
+        <w:rPr>
+          <w:rFonts w:ascii="Noto Serif SC" w:eastAsia="Noto Serif SC" w:hAnsi="Noto Serif SC" w:cs="Noto Serif"/>
+          <w:sz w:val="24"/>
+          <w:szCs w:val="24"/>
+          <w:lang w:val="en-US"/>
+        </w:rPr>
+      </w:pPr>
+      <w:r>
+        <w:rPr>
+          <w:rFonts w:ascii="Noto Serif SC" w:eastAsia="Noto Serif SC" w:hAnsi="Noto Serif SC" w:cs="Noto Serif"/>
+          <w:sz w:val="24"/>
+          <w:szCs w:val="24"/>
+          <w:lang w:val="en-US"/>
+        </w:rPr>
+        <w:t xml:space="preserve">1 </w:t>
+      </w:r>
       <w:r>
         <w:rPr>
           <w:rFonts w:ascii="Noto Serif SC" w:eastAsia="Noto Serif SC" w:hAnsi="Noto Serif SC" w:cs="Noto Serif" w:hint="eastAsia"/>
@@ -2621,28 +2848,37 @@
           <w:szCs w:val="24"/>
           <w:lang w:val="en-US"/>
         </w:rPr>
-        <w:t xml:space="preserve"> (Guzheng)</w:t>
-      </w:r>
-    </w:p>
-    <w:p>
-      <w:pPr>
-        <w:rPr>
-          <w:rFonts w:ascii="Noto Serif SC" w:eastAsia="Noto Serif SC" w:hAnsi="Noto Serif SC" w:cs="Noto Serif"/>
-          <w:sz w:val="24"/>
-          <w:szCs w:val="24"/>
-          <w:lang w:val="en-US"/>
-        </w:rPr>
-      </w:pPr>
-    </w:p>
-    <w:p>
-      <w:pPr>
-        <w:rPr>
-          <w:rFonts w:ascii="Noto Serif SC" w:eastAsia="Noto Serif SC" w:hAnsi="Noto Serif SC" w:cs="Noto Serif"/>
-          <w:sz w:val="24"/>
-          <w:szCs w:val="24"/>
-          <w:lang w:val="en-US"/>
-        </w:rPr>
-      </w:pPr>
+        <w:t xml:space="preserve"> Guzheng</w:t>
+      </w:r>
+    </w:p>
+    <w:p>
+      <w:pPr>
+        <w:rPr>
+          <w:rFonts w:ascii="Noto Serif SC" w:eastAsia="Noto Serif SC" w:hAnsi="Noto Serif SC" w:cs="Noto Serif"/>
+          <w:sz w:val="24"/>
+          <w:szCs w:val="24"/>
+          <w:lang w:val="en-US"/>
+        </w:rPr>
+      </w:pPr>
+    </w:p>
+    <w:p>
+      <w:pPr>
+        <w:rPr>
+          <w:rFonts w:ascii="Noto Serif SC" w:eastAsia="Noto Serif SC" w:hAnsi="Noto Serif SC" w:cs="Noto Serif"/>
+          <w:sz w:val="24"/>
+          <w:szCs w:val="24"/>
+          <w:lang w:val="en-US"/>
+        </w:rPr>
+      </w:pPr>
+      <w:r>
+        <w:rPr>
+          <w:rFonts w:ascii="Noto Serif SC" w:eastAsia="Noto Serif SC" w:hAnsi="Noto Serif SC" w:cs="Noto Serif"/>
+          <w:sz w:val="24"/>
+          <w:szCs w:val="24"/>
+          <w:lang w:val="en-US"/>
+        </w:rPr>
+        <w:t>1</w:t>
+      </w:r>
       <w:r>
         <w:rPr>
           <w:rFonts w:ascii="Noto Serif SC" w:eastAsia="Noto Serif SC" w:hAnsi="Noto Serif SC" w:cs="Noto Serif" w:hint="eastAsia"/>
@@ -2658,7 +2894,7 @@
           <w:szCs w:val="24"/>
           <w:lang w:val="en-US"/>
         </w:rPr>
-        <w:t xml:space="preserve"> (Timpani)</w:t>
+        <w:t xml:space="preserve"> Timpani</w:t>
       </w:r>
     </w:p>
     <w:p>
@@ -2692,14 +2928,6 @@
           <w:sz w:val="24"/>
           <w:szCs w:val="24"/>
         </w:rPr>
-        <w:t>(</w:t>
-      </w:r>
-      <w:r>
-        <w:rPr>
-          <w:rFonts w:ascii="Noto Serif SC" w:eastAsia="Noto Serif SC" w:hAnsi="Noto Serif SC" w:cs="Noto Serif"/>
-          <w:sz w:val="24"/>
-          <w:szCs w:val="24"/>
-        </w:rPr>
         <w:t>4</w:t>
       </w:r>
       <w:r>
@@ -2710,14 +2938,6 @@
         </w:rPr>
         <w:t xml:space="preserve"> Percussion</w:t>
       </w:r>
-      <w:r>
-        <w:rPr>
-          <w:rFonts w:ascii="Noto Serif SC" w:eastAsia="Noto Serif SC" w:hAnsi="Noto Serif SC" w:cs="Noto Serif"/>
-          <w:sz w:val="24"/>
-          <w:szCs w:val="24"/>
-        </w:rPr>
-        <w:t>)</w:t>
-      </w:r>
     </w:p>
     <w:p>
       <w:pPr>
@@ -2751,7 +2971,7 @@
           <w:sz w:val="20"/>
           <w:szCs w:val="20"/>
         </w:rPr>
-        <w:t xml:space="preserve"> (Bass Drum), </w:t>
+        <w:t xml:space="preserve"> Bass Drum, </w:t>
       </w:r>
       <w:r>
         <w:rPr>
@@ -2767,7 +2987,7 @@
           <w:sz w:val="20"/>
           <w:szCs w:val="20"/>
         </w:rPr>
-        <w:t xml:space="preserve"> (Bangu)</w:t>
+        <w:t xml:space="preserve"> Bangu</w:t>
       </w:r>
     </w:p>
     <w:p>
@@ -2801,7 +3021,7 @@
           <w:sz w:val="20"/>
           <w:szCs w:val="20"/>
         </w:rPr>
-        <w:t xml:space="preserve"> (Suspended Cymbals), </w:t>
+        <w:t xml:space="preserve"> Suspended Cymbal, </w:t>
       </w:r>
       <w:r>
         <w:rPr>
@@ -2817,7 +3037,7 @@
           <w:sz w:val="20"/>
           <w:szCs w:val="20"/>
         </w:rPr>
-        <w:t xml:space="preserve"> (</w:t>
+        <w:t xml:space="preserve"> </w:t>
       </w:r>
       <w:proofErr w:type="spellStart"/>
       <w:r>
@@ -2835,7 +3055,7 @@
           <w:sz w:val="20"/>
           <w:szCs w:val="20"/>
         </w:rPr>
-        <w:t xml:space="preserve">), </w:t>
+        <w:t xml:space="preserve">, </w:t>
       </w:r>
       <w:r>
         <w:rPr>
@@ -2851,7 +3071,7 @@
           <w:sz w:val="20"/>
           <w:szCs w:val="20"/>
         </w:rPr>
-        <w:t xml:space="preserve"> (Low Woodblock)</w:t>
+        <w:t xml:space="preserve"> Low Woodblock</w:t>
       </w:r>
     </w:p>
     <w:p>
@@ -2887,7 +3107,7 @@
           <w:szCs w:val="20"/>
           <w:lang w:val="en-US"/>
         </w:rPr>
-        <w:t xml:space="preserve"> (Snare Drum), </w:t>
+        <w:t xml:space="preserve"> Snare Drum, </w:t>
       </w:r>
       <w:r>
         <w:rPr>
@@ -2903,7 +3123,7 @@
           <w:sz w:val="20"/>
           <w:szCs w:val="20"/>
         </w:rPr>
-        <w:t xml:space="preserve"> (Tambourine), </w:t>
+        <w:t xml:space="preserve"> Tambourine, </w:t>
       </w:r>
       <w:r>
         <w:rPr>
@@ -2919,7 +3139,7 @@
           <w:sz w:val="20"/>
           <w:szCs w:val="20"/>
         </w:rPr>
-        <w:t xml:space="preserve"> (Glockenspiel), </w:t>
+        <w:t xml:space="preserve"> Glockenspiel, </w:t>
       </w:r>
       <w:r>
         <w:rPr>
@@ -2935,7 +3155,7 @@
           <w:sz w:val="20"/>
           <w:szCs w:val="20"/>
         </w:rPr>
-        <w:t xml:space="preserve"> (Xiaobo), </w:t>
+        <w:t xml:space="preserve"> Xiaobo, </w:t>
       </w:r>
       <w:r>
         <w:rPr>
@@ -2951,7 +3171,7 @@
           <w:sz w:val="20"/>
           <w:szCs w:val="20"/>
         </w:rPr>
-        <w:t xml:space="preserve"> (</w:t>
+        <w:t xml:space="preserve"> </w:t>
       </w:r>
       <w:proofErr w:type="spellStart"/>
       <w:r>
@@ -2963,14 +3183,6 @@
         <w:t>Xiaotanggu</w:t>
       </w:r>
       <w:proofErr w:type="spellEnd"/>
-      <w:r>
-        <w:rPr>
-          <w:rFonts w:ascii="Noto Serif SC" w:eastAsia="Noto Serif SC" w:hAnsi="Noto Serif SC" w:cs="Noto Serif"/>
-          <w:sz w:val="20"/>
-          <w:szCs w:val="20"/>
-        </w:rPr>
-        <w:t>)</w:t>
-      </w:r>
     </w:p>
     <w:p>
       <w:pPr>
@@ -3004,7 +3216,7 @@
           <w:sz w:val="20"/>
           <w:szCs w:val="20"/>
         </w:rPr>
-        <w:t xml:space="preserve"> (Whip), </w:t>
+        <w:t xml:space="preserve"> Whip, </w:t>
       </w:r>
       <w:r>
         <w:rPr>
@@ -3020,7 +3232,7 @@
           <w:sz w:val="20"/>
           <w:szCs w:val="20"/>
         </w:rPr>
-        <w:t xml:space="preserve"> (</w:t>
+        <w:t xml:space="preserve"> </w:t>
       </w:r>
       <w:proofErr w:type="spellStart"/>
       <w:r>
@@ -3038,7 +3250,7 @@
           <w:sz w:val="20"/>
           <w:szCs w:val="20"/>
         </w:rPr>
-        <w:t xml:space="preserve">), </w:t>
+        <w:t xml:space="preserve">, </w:t>
       </w:r>
       <w:r>
         <w:rPr>
@@ -3055,7 +3267,7 @@
           <w:szCs w:val="20"/>
           <w:lang w:val="en-GB"/>
         </w:rPr>
-        <w:t xml:space="preserve"> (</w:t>
+        <w:t xml:space="preserve"> </w:t>
       </w:r>
       <w:proofErr w:type="spellStart"/>
       <w:r>
@@ -3073,7 +3285,7 @@
           <w:sz w:val="20"/>
           <w:szCs w:val="20"/>
         </w:rPr>
-        <w:t xml:space="preserve">), </w:t>
+        <w:t xml:space="preserve">, </w:t>
       </w:r>
       <w:r>
         <w:rPr>
@@ -3089,7 +3301,7 @@
           <w:sz w:val="20"/>
           <w:szCs w:val="20"/>
         </w:rPr>
-        <w:t xml:space="preserve"> (</w:t>
+        <w:t xml:space="preserve"> </w:t>
       </w:r>
       <w:proofErr w:type="spellStart"/>
       <w:r>
@@ -3107,7 +3319,7 @@
           <w:sz w:val="20"/>
           <w:szCs w:val="20"/>
         </w:rPr>
-        <w:t xml:space="preserve">), </w:t>
+        <w:t xml:space="preserve">, </w:t>
       </w:r>
       <w:r>
         <w:rPr>
@@ -3123,7 +3335,7 @@
           <w:sz w:val="20"/>
           <w:szCs w:val="20"/>
         </w:rPr>
-        <w:t xml:space="preserve"> (Crash Cymbals)</w:t>
+        <w:t xml:space="preserve"> Crash Cymbals</w:t>
       </w:r>
     </w:p>
     <w:p>
@@ -3161,7 +3373,7 @@
           <w:szCs w:val="24"/>
           <w:lang w:val="en-US"/>
         </w:rPr>
-        <w:t xml:space="preserve"> (Gaohu)</w:t>
+        <w:t xml:space="preserve"> Gaohu</w:t>
       </w:r>
     </w:p>
     <w:p>
@@ -3189,7 +3401,7 @@
           <w:szCs w:val="24"/>
           <w:lang w:val="en-US"/>
         </w:rPr>
-        <w:t xml:space="preserve"> (Erhu)</w:t>
+        <w:t xml:space="preserve"> Erhu</w:t>
       </w:r>
     </w:p>
     <w:p>
@@ -3217,7 +3429,7 @@
           <w:szCs w:val="24"/>
           <w:lang w:val="en-US"/>
         </w:rPr>
-        <w:t xml:space="preserve"> (Zhonghu)</w:t>
+        <w:t xml:space="preserve"> Zhonghu</w:t>
       </w:r>
     </w:p>
     <w:p>
@@ -3245,7 +3457,7 @@
           <w:szCs w:val="24"/>
           <w:lang w:val="en-US"/>
         </w:rPr>
-        <w:t xml:space="preserve"> (Violoncello)</w:t>
+        <w:t xml:space="preserve"> Violoncello</w:t>
       </w:r>
     </w:p>
     <w:p>
@@ -3273,7 +3485,7 @@
           <w:szCs w:val="24"/>
           <w:lang w:val="en-US"/>
         </w:rPr>
-        <w:t xml:space="preserve"> (Contrabass)</w:t>
+        <w:t xml:space="preserve"> Contrabass</w:t>
       </w:r>
     </w:p>
     <w:p>

</xml_diff>

<commit_message>
Edit to v6a Front Matter
</commit_message>
<xml_diff>
--- a/Front Matter/Front Matter_v6a.docx
+++ b/Front Matter/Front Matter_v6a.docx
@@ -20,8 +20,8 @@
         <w:rPr>
           <w:rFonts w:ascii="Noto Serif SC" w:eastAsia="Noto Serif SC" w:hAnsi="Noto Serif SC" w:cs="Noto Serif"/>
           <w:b/>
-          <w:sz w:val="130"/>
-          <w:szCs w:val="130"/>
+          <w:sz w:val="120"/>
+          <w:szCs w:val="120"/>
           <w:lang w:val="en-US" w:eastAsia="zh-TW"/>
         </w:rPr>
       </w:pPr>
@@ -29,8 +29,8 @@
         <w:rPr>
           <w:rFonts w:ascii="Noto Serif SC" w:eastAsia="Noto Serif SC" w:hAnsi="Noto Serif SC" w:cs="Noto Serif" w:hint="eastAsia"/>
           <w:b/>
-          <w:sz w:val="130"/>
-          <w:szCs w:val="130"/>
+          <w:sz w:val="120"/>
+          <w:szCs w:val="120"/>
           <w:lang w:val="en-US"/>
         </w:rPr>
         <w:t>狮城漫步</w:t>

</xml_diff>